<commit_message>
Documentation: Tag 2 in der Tagesdoku verfertigt
</commit_message>
<xml_diff>
--- a/Dokumentation/Tagesdokumentation.docx
+++ b/Dokumentation/Tagesdokumentation.docx
@@ -3,282 +3,6 @@
 <w:document xmlns:wpc="http://schemas.microsoft.com/office/word/2010/wordprocessingCanvas" xmlns:cx="http://schemas.microsoft.com/office/drawing/2014/chartex" xmlns:cx1="http://schemas.microsoft.com/office/drawing/2015/9/8/chartex" xmlns:cx2="http://schemas.microsoft.com/office/drawing/2015/10/21/chartex" xmlns:cx3="http://schemas.microsoft.com/office/drawing/2016/5/9/chartex" xmlns:cx4="http://schemas.microsoft.com/office/drawing/2016/5/10/chartex" xmlns:cx5="http://schemas.microsoft.com/office/drawing/2016/5/11/chartex" xmlns:cx6="http://schemas.microsoft.com/office/drawing/2016/5/12/chartex" xmlns:cx7="http://schemas.microsoft.com/office/drawing/2016/5/13/chartex" xmlns:cx8="http://schemas.microsoft.com/office/drawing/2016/5/14/chartex" xmlns:mc="http://schemas.openxmlformats.org/markup-compatibility/2006" xmlns:aink="http://schemas.microsoft.com/office/drawing/2016/ink" xmlns:am3d="http://schemas.microsoft.com/office/drawing/2017/model3d" xmlns:o="urn:schemas-microsoft-com:office:office" xmlns:oel="http://schemas.microsoft.com/office/2019/extlst" xmlns:r="http://schemas.openxmlformats.org/officeDocument/2006/relationships" xmlns:m="http://schemas.openxmlformats.org/officeDocument/2006/math" xmlns:v="urn:schemas-microsoft-com:vml" xmlns:wp14="http://schemas.microsoft.com/office/word/2010/wordprocessingDrawing" xmlns:wp="http://schemas.openxmlformats.org/drawingml/2006/wordprocessingDrawing" xmlns:w10="urn:schemas-microsoft-com:office:word" xmlns:w="http://schemas.openxmlformats.org/wordprocessingml/2006/main" xmlns:w14="http://schemas.microsoft.com/office/word/2010/wordml" xmlns:w15="http://schemas.microsoft.com/office/word/2012/wordml" xmlns:w16cei="http://schemas.microsoft.com/office/word/2026/wordml/cei" xmlns:w16cex="http://schemas.microsoft.com/office/word/2018/wordml/cex" xmlns:w16cid="http://schemas.microsoft.com/office/word/2016/wordml/cid" xmlns:w16="http://schemas.microsoft.com/office/word/2018/wordml" xmlns:w16du="http://schemas.microsoft.com/office/word/2023/wordml/word16du" xmlns:w16sdtdh="http://schemas.microsoft.com/office/word/2020/wordml/sdtdatahash" xmlns:w16sdtfl="http://schemas.microsoft.com/office/word/2024/wordml/sdtformatlock" xmlns:w16se="http://schemas.microsoft.com/office/word/2015/wordml/symex" xmlns:wpg="http://schemas.microsoft.com/office/word/2010/wordprocessingGroup" xmlns:wpi="http://schemas.microsoft.com/office/word/2010/wordprocessingInk" xmlns:wne="http://schemas.microsoft.com/office/word/2006/wordml" xmlns:wps="http://schemas.microsoft.com/office/word/2010/wordprocessingShape" mc:Ignorable="w14 w15 w16se w16cid w16 w16cex w16sdtdh w16sdtfl w16du wp14">
   <w:body>
     <w:p>
-      <w:r>
-        <w:t>Tagesd</w:t>
-      </w:r>
-      <w:r>
-        <w:t>okumentation</w:t>
-      </w:r>
-    </w:p>
-    <w:p/>
-    <w:p>
-      <w:r>
-        <w:t>Tag 1</w:t>
-      </w:r>
-    </w:p>
-    <w:p>
-      <w:r>
-        <w:t>VM aufstarten nicht funktioniert</w:t>
-      </w:r>
-    </w:p>
-    <w:p>
-      <w:r>
-        <w:t>Grund: Prozessor zu schwach rechtsklick windows -&gt; System</w:t>
-      </w:r>
-    </w:p>
-    <w:p>
-      <w:r>
-        <w:rPr>
-          <w:bCs/>
-        </w:rPr>
-        <w:t>Der AMD Ryzen 5 7530U hat 6 Kerne</w:t>
-      </w:r>
-      <w:r>
-        <w:rPr>
-          <w:bCs/>
-        </w:rPr>
-        <w:t xml:space="preserve"> und 12 Threads</w:t>
-      </w:r>
-      <w:r>
-        <w:t>.</w:t>
-      </w:r>
-    </w:p>
-    <w:p/>
-    <w:p>
-      <w:pPr>
-        <w:numPr>
-          <w:ilvl w:val="0"/>
-          <w:numId w:val="1"/>
-        </w:numPr>
-        <w:rPr>
-          <w:bCs/>
-          <w:lang w:val="en-US"/>
-        </w:rPr>
-      </w:pPr>
-      <w:r>
-        <w:rPr>
-          <w:bCs/>
-          <w:lang w:val="en-US"/>
-        </w:rPr>
-        <w:t xml:space="preserve">Technologien </w:t>
-      </w:r>
-    </w:p>
-    <w:p>
-      <w:pPr>
-        <w:numPr>
-          <w:ilvl w:val="1"/>
-          <w:numId w:val="1"/>
-        </w:numPr>
-        <w:rPr>
-          <w:bCs/>
-          <w:lang w:val="en-US"/>
-        </w:rPr>
-      </w:pPr>
-      <w:r>
-        <w:rPr>
-          <w:bCs/>
-          <w:lang w:val="en-US"/>
-        </w:rPr>
-        <w:t xml:space="preserve">Backend: Spring Boot, Java </w:t>
-      </w:r>
-    </w:p>
-    <w:p>
-      <w:pPr>
-        <w:numPr>
-          <w:ilvl w:val="1"/>
-          <w:numId w:val="1"/>
-        </w:numPr>
-        <w:rPr>
-          <w:bCs/>
-          <w:lang w:val="en-US"/>
-        </w:rPr>
-      </w:pPr>
-      <w:r>
-        <w:rPr>
-          <w:bCs/>
-          <w:lang w:val="en-US"/>
-        </w:rPr>
-        <w:t xml:space="preserve">Frontend: React </w:t>
-      </w:r>
-    </w:p>
-    <w:p>
-      <w:pPr>
-        <w:numPr>
-          <w:ilvl w:val="1"/>
-          <w:numId w:val="1"/>
-        </w:numPr>
-        <w:rPr>
-          <w:bCs/>
-          <w:lang w:val="en-US"/>
-        </w:rPr>
-      </w:pPr>
-      <w:r>
-        <w:rPr>
-          <w:bCs/>
-          <w:lang w:val="en-US"/>
-        </w:rPr>
-        <w:t xml:space="preserve">Datenbank: MySQL/MariaDB </w:t>
-      </w:r>
-    </w:p>
-    <w:p>
-      <w:pPr>
-        <w:numPr>
-          <w:ilvl w:val="1"/>
-          <w:numId w:val="1"/>
-        </w:numPr>
-        <w:rPr>
-          <w:bCs/>
-          <w:lang w:val="en-US"/>
-        </w:rPr>
-      </w:pPr>
-      <w:r>
-        <w:rPr>
-          <w:bCs/>
-          <w:lang w:val="en-US"/>
-        </w:rPr>
-        <w:t xml:space="preserve">Tools: Docker, Git usw. </w:t>
-      </w:r>
-    </w:p>
-    <w:p>
-      <w:pPr>
-        <w:ind w:left="0" w:firstLine="0"/>
-        <w:rPr>
-          <w:bCs/>
-          <w:lang w:val="en-US"/>
-        </w:rPr>
-      </w:pPr>
-    </w:p>
-    <w:p>
-      <w:pPr>
-        <w:ind w:left="0" w:firstLine="0"/>
-        <w:rPr>
-          <w:bCs/>
-          <w:lang w:val="en-US"/>
-        </w:rPr>
-      </w:pPr>
-    </w:p>
-    <w:p>
-      <w:pPr>
-        <w:ind w:left="0" w:firstLine="0"/>
-        <w:rPr>
-          <w:bCs/>
-          <w:lang w:val="en-US"/>
-        </w:rPr>
-      </w:pPr>
-      <w:r>
-        <w:rPr>
-          <w:bCs/>
-          <w:lang w:val="en-US"/>
-        </w:rPr>
-        <w:t>tagesdokumentation:</w:t>
-      </w:r>
-    </w:p>
-    <w:p>
-      <w:pPr>
-        <w:ind w:left="0" w:firstLine="0"/>
-        <w:rPr>
-          <w:bCs/>
-          <w:lang w:val="en-US"/>
-        </w:rPr>
-      </w:pPr>
-      <w:r>
-        <w:rPr>
-          <w:bCs/>
-          <w:lang w:val="en-US"/>
-        </w:rPr>
-        <w:t>ich habe heute:</w:t>
-      </w:r>
-    </w:p>
-    <w:p>
-      <w:pPr>
-        <w:ind w:left="0" w:firstLine="0"/>
-        <w:rPr>
-          <w:bCs/>
-          <w:lang w:val="en-US"/>
-        </w:rPr>
-      </w:pPr>
-      <w:r>
-        <w:rPr>
-          <w:bCs/>
-          <w:lang w:val="en-US"/>
-        </w:rPr>
-        <w:t xml:space="preserve">Wir haben heute morgen versucht die OpenSuse VM bei mir einzurichten dies ging nicht weil mein prozessor zu schwach ist. Ich habe </w:t>
-      </w:r>
-      <w:r>
-        <w:rPr>
-          <w:bCs/>
-          <w:lang w:val="en-US"/>
-        </w:rPr>
-        <w:t xml:space="preserve">die basis Struktur des projekts fertig gemacht wie z.b die DB als docker compose file erstellt, das frontend mit React erstellt und das Backend mit Springboot erstellt dazu habe ich schon die erste funktionierende Version der Applikation die aktuell nur geräte neu erfassen kann und diese </w:t>
-      </w:r>
-      <w:r>
-        <w:rPr>
-          <w:bCs/>
-          <w:lang w:val="en-US"/>
-        </w:rPr>
-        <w:t xml:space="preserve">in einer Liste </w:t>
-      </w:r>
-      <w:r>
-        <w:rPr>
-          <w:bCs/>
-          <w:lang w:val="en-US"/>
-        </w:rPr>
-        <w:t>anzeigen kann</w:t>
-      </w:r>
-      <w:r>
-        <w:rPr>
-          <w:bCs/>
-          <w:lang w:val="en-US"/>
-        </w:rPr>
-        <w:t xml:space="preserve">. Für das Projekt habe ich auf github ein repositorry gemacht. Dazu habe ich bei der Dokumentation die anforderungsanalyse gemacht und im Projektstruktur.md die ganze Struktur des Projekts erklärt. </w:t>
-      </w:r>
-    </w:p>
-    <w:p>
-      <w:pPr>
-        <w:ind w:left="0" w:firstLine="0"/>
-        <w:rPr>
-          <w:bCs/>
-          <w:lang w:val="en-US"/>
-        </w:rPr>
-      </w:pPr>
-    </w:p>
-    <w:p>
-      <w:pPr>
-        <w:ind w:left="0" w:firstLine="0"/>
-        <w:rPr>
-          <w:bCs/>
-          <w:lang w:val="en-US"/>
-        </w:rPr>
-      </w:pPr>
-    </w:p>
-    <w:p>
-      <w:pPr>
-        <w:ind w:left="0" w:firstLine="0"/>
-        <w:rPr>
-          <w:bCs/>
-          <w:lang w:val="en-US"/>
-        </w:rPr>
-      </w:pPr>
-    </w:p>
-    <w:p>
-      <w:pPr>
-        <w:ind w:left="0" w:firstLine="0"/>
-        <w:rPr>
-          <w:bCs/>
-          <w:lang w:val="en-US"/>
-        </w:rPr>
-      </w:pPr>
-    </w:p>
-    <w:p>
-      <w:pPr>
-        <w:ind w:left="0" w:firstLine="0"/>
-        <w:rPr>
-          <w:bCs/>
-          <w:lang w:val="en-US"/>
-        </w:rPr>
-      </w:pPr>
-    </w:p>
-    <w:p>
       <w:pPr>
         <w:pStyle w:val="Titel"/>
         <w:ind w:left="0" w:firstLine="0"/>
@@ -290,7 +14,6 @@
         <w:rPr>
           <w:lang w:val="en-US"/>
         </w:rPr>
-        <w:lastRenderedPageBreak/>
         <w:t>Tagesdokumentation – Tag 1</w:t>
       </w:r>
     </w:p>
@@ -315,14 +38,7 @@
           <w:lang w:val="en-US"/>
         </w:rPr>
         <w:noBreakHyphen/>
-        <w:t xml:space="preserve">VM auf meinem Gerät einzurichten. Der Start der VM war jedoch nicht möglich, da mein Prozessor dafür zu schwach ist. Über </w:t>
-      </w:r>
-      <w:r>
-        <w:rPr>
-          <w:bCs/>
-          <w:lang w:val="en-US"/>
-        </w:rPr>
-        <w:t xml:space="preserve">Rechtsklick auf </w:t>
+        <w:t xml:space="preserve">VM auf meinem Gerät einzurichten. Der Start der VM war jedoch nicht möglich, da mein Prozessor dafür zu schwach ist. Über Rechtsklick auf </w:t>
       </w:r>
       <w:r>
         <w:rPr>
@@ -566,6 +282,912 @@
           <w:lang w:val="en-US"/>
         </w:rPr>
       </w:pPr>
+    </w:p>
+    <w:p>
+      <w:pPr>
+        <w:ind w:left="0" w:firstLine="0"/>
+        <w:rPr>
+          <w:bCs/>
+          <w:lang w:val="en-US"/>
+        </w:rPr>
+      </w:pPr>
+      <w:r>
+        <w:rPr>
+          <w:bCs/>
+          <w:lang w:val="en-US"/>
+        </w:rPr>
+        <w:br/>
+      </w:r>
+    </w:p>
+    <w:p>
+      <w:pPr>
+        <w:rPr>
+          <w:bCs/>
+          <w:lang w:val="en-US"/>
+        </w:rPr>
+      </w:pPr>
+      <w:r>
+        <w:rPr>
+          <w:bCs/>
+          <w:lang w:val="en-US"/>
+        </w:rPr>
+        <w:br w:type="page"/>
+      </w:r>
+    </w:p>
+    <w:p>
+      <w:pPr>
+        <w:pStyle w:val="Titel"/>
+        <w:ind w:left="0" w:firstLine="0"/>
+        <w:rPr>
+          <w:lang w:val="en-US"/>
+        </w:rPr>
+      </w:pPr>
+      <w:r>
+        <w:rPr>
+          <w:lang w:val="en-US"/>
+        </w:rPr>
+        <w:lastRenderedPageBreak/>
+        <w:t xml:space="preserve">Tagesdokumentation – Tag </w:t>
+      </w:r>
+      <w:r>
+        <w:rPr>
+          <w:lang w:val="en-US"/>
+        </w:rPr>
+        <w:t>2</w:t>
+      </w:r>
+    </w:p>
+    <w:p>
+      <w:pPr>
+        <w:ind w:left="0" w:firstLine="0"/>
+        <w:rPr>
+          <w:bCs/>
+          <w:lang w:val="en-US"/>
+        </w:rPr>
+      </w:pPr>
+    </w:p>
+    <w:p>
+      <w:pPr>
+        <w:ind w:left="0" w:firstLine="0"/>
+        <w:rPr>
+          <w:bCs/>
+          <w:lang w:val="en-US"/>
+        </w:rPr>
+      </w:pPr>
+      <w:r>
+        <w:rPr>
+          <w:bCs/>
+          <w:lang w:val="en-US"/>
+        </w:rPr>
+        <w:t xml:space="preserve">Am Morgen habe ich die grundlegenden Funktionen im Backend erweitert. Dazu gehören das </w:t>
+      </w:r>
+      <w:r>
+        <w:rPr>
+          <w:b/>
+          <w:bCs/>
+          <w:lang w:val="en-US"/>
+        </w:rPr>
+        <w:t>Löschen</w:t>
+      </w:r>
+      <w:r>
+        <w:rPr>
+          <w:bCs/>
+          <w:lang w:val="en-US"/>
+        </w:rPr>
+        <w:t xml:space="preserve">, </w:t>
+      </w:r>
+      <w:r>
+        <w:rPr>
+          <w:b/>
+          <w:bCs/>
+          <w:lang w:val="en-US"/>
+        </w:rPr>
+        <w:t>Bearbeiten</w:t>
+      </w:r>
+      <w:r>
+        <w:rPr>
+          <w:bCs/>
+          <w:lang w:val="en-US"/>
+        </w:rPr>
+        <w:t xml:space="preserve"> und </w:t>
+      </w:r>
+      <w:r>
+        <w:rPr>
+          <w:b/>
+          <w:bCs/>
+          <w:lang w:val="en-US"/>
+        </w:rPr>
+        <w:t>Suchen</w:t>
+      </w:r>
+      <w:r>
+        <w:rPr>
+          <w:bCs/>
+          <w:lang w:val="en-US"/>
+        </w:rPr>
+        <w:t xml:space="preserve"> von Geräten. Diese Funktionen wurden erfolgreich eingebaut und getestet.</w:t>
+      </w:r>
+    </w:p>
+    <w:p>
+      <w:pPr>
+        <w:ind w:left="0" w:firstLine="0"/>
+        <w:rPr>
+          <w:bCs/>
+          <w:lang w:val="en-US"/>
+        </w:rPr>
+      </w:pPr>
+      <w:r>
+        <w:rPr>
+          <w:bCs/>
+          <w:lang w:val="en-US"/>
+        </w:rPr>
+        <w:t xml:space="preserve">Im Anschluss habe ich mich mit der Persistenz beschäftigt. Ich habe </w:t>
+      </w:r>
+      <w:r>
+        <w:rPr>
+          <w:b/>
+          <w:bCs/>
+          <w:lang w:val="en-US"/>
+        </w:rPr>
+        <w:t>Persistent Volumes</w:t>
+      </w:r>
+      <w:r>
+        <w:rPr>
+          <w:bCs/>
+          <w:lang w:val="en-US"/>
+        </w:rPr>
+        <w:t xml:space="preserve"> eingerichtet und überprüft, ob die Daten dauerhaft gespeichert werden. Die Tests verliefen erfolgreich, sodass die Geräteinformationen auch nach einem Neustart erhalten bleiben.</w:t>
+      </w:r>
+    </w:p>
+    <w:p>
+      <w:pPr>
+        <w:ind w:left="0" w:firstLine="0"/>
+        <w:rPr>
+          <w:bCs/>
+          <w:lang w:val="en-US"/>
+        </w:rPr>
+      </w:pPr>
+      <w:r>
+        <w:rPr>
+          <w:bCs/>
+          <w:lang w:val="en-US"/>
+        </w:rPr>
+        <w:t xml:space="preserve">Zuhause habe ich im </w:t>
+      </w:r>
+      <w:r>
+        <w:rPr>
+          <w:b/>
+          <w:bCs/>
+          <w:lang w:val="en-US"/>
+        </w:rPr>
+        <w:t>Frontend</w:t>
+      </w:r>
+      <w:r>
+        <w:rPr>
+          <w:bCs/>
+          <w:lang w:val="en-US"/>
+        </w:rPr>
+        <w:t xml:space="preserve"> ein </w:t>
+      </w:r>
+      <w:r>
+        <w:rPr>
+          <w:b/>
+          <w:bCs/>
+          <w:lang w:val="en-US"/>
+        </w:rPr>
+        <w:t>Modal Component</w:t>
+      </w:r>
+      <w:r>
+        <w:rPr>
+          <w:bCs/>
+          <w:lang w:val="en-US"/>
+        </w:rPr>
+        <w:t xml:space="preserve"> eingebaut, das als Formular für das Anlegen neuer Geräte dient. Damit können Benutzer direkt in der Oberfläche neue Geräte erfassen.</w:t>
+      </w:r>
+    </w:p>
+    <w:p>
+      <w:pPr>
+        <w:spacing w:line="240" w:lineRule="auto"/>
+        <w:ind w:left="0" w:firstLine="0"/>
+        <w:rPr>
+          <w:bCs/>
+          <w:lang w:val="en-US"/>
+        </w:rPr>
+      </w:pPr>
+      <w:r>
+        <w:rPr>
+          <w:bCs/>
+          <w:lang w:val="en-US"/>
+        </w:rPr>
+        <w:t xml:space="preserve">Zusätzlich habe ich erste </w:t>
+      </w:r>
+      <w:r>
+        <w:rPr>
+          <w:b/>
+          <w:bCs/>
+          <w:lang w:val="en-US"/>
+        </w:rPr>
+        <w:t>Sicherheitsfunktionen</w:t>
+      </w:r>
+      <w:r>
+        <w:rPr>
+          <w:bCs/>
+          <w:lang w:val="en-US"/>
+        </w:rPr>
+        <w:t xml:space="preserve"> implementiert:</w:t>
+      </w:r>
+    </w:p>
+    <w:p>
+      <w:pPr>
+        <w:numPr>
+          <w:ilvl w:val="0"/>
+          <w:numId w:val="11"/>
+        </w:numPr>
+        <w:spacing w:line="240" w:lineRule="auto"/>
+        <w:rPr>
+          <w:bCs/>
+          <w:lang w:val="en-US"/>
+        </w:rPr>
+      </w:pPr>
+      <w:r>
+        <w:rPr>
+          <w:b/>
+          <w:bCs/>
+          <w:lang w:val="en-US"/>
+        </w:rPr>
+        <w:t>Rate Limiting</w:t>
+      </w:r>
+    </w:p>
+    <w:p>
+      <w:pPr>
+        <w:numPr>
+          <w:ilvl w:val="1"/>
+          <w:numId w:val="11"/>
+        </w:numPr>
+        <w:spacing w:line="240" w:lineRule="auto"/>
+        <w:rPr>
+          <w:bCs/>
+          <w:lang w:val="en-US"/>
+        </w:rPr>
+      </w:pPr>
+      <w:r>
+        <w:rPr>
+          <w:bCs/>
+          <w:lang w:val="en-US"/>
+        </w:rPr>
+        <w:t>Klasse: RateLimitingFilter</w:t>
+      </w:r>
+    </w:p>
+    <w:p>
+      <w:pPr>
+        <w:numPr>
+          <w:ilvl w:val="1"/>
+          <w:numId w:val="11"/>
+        </w:numPr>
+        <w:spacing w:line="240" w:lineRule="auto"/>
+        <w:rPr>
+          <w:bCs/>
+          <w:lang w:val="en-US"/>
+        </w:rPr>
+      </w:pPr>
+      <w:r>
+        <w:rPr>
+          <w:bCs/>
+          <w:lang w:val="en-US"/>
+        </w:rPr>
+        <w:t xml:space="preserve">Limitiert Anfragen pro IP auf </w:t>
+      </w:r>
+      <w:r>
+        <w:rPr>
+          <w:b/>
+          <w:bCs/>
+          <w:lang w:val="en-US"/>
+        </w:rPr>
+        <w:t>60 Requests pro Minute</w:t>
+      </w:r>
+      <w:r>
+        <w:rPr>
+          <w:bCs/>
+          <w:lang w:val="en-US"/>
+        </w:rPr>
+        <w:t xml:space="preserve"> für den Endpunkt /devices.</w:t>
+      </w:r>
+    </w:p>
+    <w:p>
+      <w:pPr>
+        <w:numPr>
+          <w:ilvl w:val="1"/>
+          <w:numId w:val="11"/>
+        </w:numPr>
+        <w:spacing w:line="240" w:lineRule="auto"/>
+        <w:rPr>
+          <w:bCs/>
+          <w:lang w:val="en-US"/>
+        </w:rPr>
+      </w:pPr>
+      <w:r>
+        <w:rPr>
+          <w:bCs/>
+          <w:lang w:val="en-US"/>
+        </w:rPr>
+        <w:t>Vorteil: Schutz vor Überlastung oder Denial</w:t>
+      </w:r>
+      <w:r>
+        <w:rPr>
+          <w:bCs/>
+          <w:lang w:val="en-US"/>
+        </w:rPr>
+        <w:noBreakHyphen/>
+        <w:t>of</w:t>
+      </w:r>
+      <w:r>
+        <w:rPr>
+          <w:bCs/>
+          <w:lang w:val="en-US"/>
+        </w:rPr>
+        <w:noBreakHyphen/>
+        <w:t>Service</w:t>
+      </w:r>
+      <w:r>
+        <w:rPr>
+          <w:bCs/>
+          <w:lang w:val="en-US"/>
+        </w:rPr>
+        <w:noBreakHyphen/>
+        <w:t>Attacken.</w:t>
+      </w:r>
+    </w:p>
+    <w:p>
+      <w:pPr>
+        <w:numPr>
+          <w:ilvl w:val="1"/>
+          <w:numId w:val="11"/>
+        </w:numPr>
+        <w:spacing w:line="240" w:lineRule="auto"/>
+        <w:rPr>
+          <w:bCs/>
+          <w:lang w:val="en-US"/>
+        </w:rPr>
+      </w:pPr>
+      <w:r>
+        <w:rPr>
+          <w:bCs/>
+          <w:lang w:val="en-US"/>
+        </w:rPr>
+        <w:t xml:space="preserve">Besonderheit: Umsetzung mit </w:t>
+      </w:r>
+      <w:r>
+        <w:rPr>
+          <w:b/>
+          <w:bCs/>
+          <w:lang w:val="en-US"/>
+        </w:rPr>
+        <w:t>Sliding Window</w:t>
+      </w:r>
+      <w:r>
+        <w:rPr>
+          <w:bCs/>
+          <w:lang w:val="en-US"/>
+        </w:rPr>
+        <w:t xml:space="preserve"> basierend auf Instant und Duration.</w:t>
+      </w:r>
+    </w:p>
+    <w:p>
+      <w:pPr>
+        <w:numPr>
+          <w:ilvl w:val="0"/>
+          <w:numId w:val="11"/>
+        </w:numPr>
+        <w:spacing w:line="240" w:lineRule="auto"/>
+        <w:rPr>
+          <w:bCs/>
+          <w:lang w:val="en-US"/>
+        </w:rPr>
+      </w:pPr>
+      <w:r>
+        <w:rPr>
+          <w:b/>
+          <w:bCs/>
+          <w:lang w:val="en-US"/>
+        </w:rPr>
+        <w:t>Spring Security Grundkonfiguration</w:t>
+      </w:r>
+    </w:p>
+    <w:p>
+      <w:pPr>
+        <w:numPr>
+          <w:ilvl w:val="1"/>
+          <w:numId w:val="11"/>
+        </w:numPr>
+        <w:spacing w:line="240" w:lineRule="auto"/>
+        <w:rPr>
+          <w:bCs/>
+          <w:lang w:val="en-US"/>
+        </w:rPr>
+      </w:pPr>
+      <w:r>
+        <w:rPr>
+          <w:bCs/>
+          <w:lang w:val="en-US"/>
+        </w:rPr>
+        <w:t>Klasse: SecurityConfig</w:t>
+      </w:r>
+    </w:p>
+    <w:p>
+      <w:pPr>
+        <w:numPr>
+          <w:ilvl w:val="1"/>
+          <w:numId w:val="11"/>
+        </w:numPr>
+        <w:spacing w:line="240" w:lineRule="auto"/>
+        <w:rPr>
+          <w:bCs/>
+          <w:lang w:val="en-US"/>
+        </w:rPr>
+      </w:pPr>
+      <w:r>
+        <w:rPr>
+          <w:bCs/>
+          <w:lang w:val="en-US"/>
+        </w:rPr>
+        <w:t>Enthält:</w:t>
+      </w:r>
+    </w:p>
+    <w:p>
+      <w:pPr>
+        <w:numPr>
+          <w:ilvl w:val="2"/>
+          <w:numId w:val="11"/>
+        </w:numPr>
+        <w:spacing w:line="240" w:lineRule="auto"/>
+        <w:rPr>
+          <w:bCs/>
+          <w:lang w:val="en-US"/>
+        </w:rPr>
+      </w:pPr>
+      <w:r>
+        <w:rPr>
+          <w:b/>
+          <w:bCs/>
+          <w:lang w:val="en-US"/>
+        </w:rPr>
+        <w:t>CSRF deaktiviert</w:t>
+      </w:r>
+      <w:r>
+        <w:rPr>
+          <w:bCs/>
+          <w:lang w:val="en-US"/>
+        </w:rPr>
+        <w:t xml:space="preserve"> (da reines API</w:t>
+      </w:r>
+      <w:r>
+        <w:rPr>
+          <w:bCs/>
+          <w:lang w:val="en-US"/>
+        </w:rPr>
+        <w:noBreakHyphen/>
+        <w:t>Backend).</w:t>
+      </w:r>
+    </w:p>
+    <w:p>
+      <w:pPr>
+        <w:numPr>
+          <w:ilvl w:val="2"/>
+          <w:numId w:val="11"/>
+        </w:numPr>
+        <w:spacing w:line="240" w:lineRule="auto"/>
+        <w:rPr>
+          <w:bCs/>
+          <w:lang w:val="en-US"/>
+        </w:rPr>
+      </w:pPr>
+      <w:r>
+        <w:rPr>
+          <w:b/>
+          <w:bCs/>
+          <w:lang w:val="en-US"/>
+        </w:rPr>
+        <w:t>CORS aktiviert</w:t>
+      </w:r>
+      <w:r>
+        <w:rPr>
+          <w:bCs/>
+          <w:lang w:val="en-US"/>
+        </w:rPr>
+        <w:t xml:space="preserve"> mit eigener Konfiguration.</w:t>
+      </w:r>
+    </w:p>
+    <w:p>
+      <w:pPr>
+        <w:numPr>
+          <w:ilvl w:val="2"/>
+          <w:numId w:val="11"/>
+        </w:numPr>
+        <w:spacing w:line="240" w:lineRule="auto"/>
+        <w:rPr>
+          <w:bCs/>
+          <w:lang w:val="en-US"/>
+        </w:rPr>
+      </w:pPr>
+      <w:r>
+        <w:rPr>
+          <w:bCs/>
+          <w:lang w:val="en-US"/>
+        </w:rPr>
+        <w:t>Aktuell permitAll() → noch keine Authentifizierung, aber Struktur vorbereitet.</w:t>
+      </w:r>
+    </w:p>
+    <w:p>
+      <w:pPr>
+        <w:numPr>
+          <w:ilvl w:val="2"/>
+          <w:numId w:val="11"/>
+        </w:numPr>
+        <w:spacing w:line="240" w:lineRule="auto"/>
+        <w:rPr>
+          <w:bCs/>
+          <w:lang w:val="en-US"/>
+        </w:rPr>
+      </w:pPr>
+      <w:r>
+        <w:rPr>
+          <w:b/>
+          <w:bCs/>
+          <w:lang w:val="en-US"/>
+        </w:rPr>
+        <w:t>Security Headers aktiv</w:t>
+      </w:r>
+      <w:r>
+        <w:rPr>
+          <w:bCs/>
+          <w:lang w:val="en-US"/>
+        </w:rPr>
+        <w:t>:</w:t>
+      </w:r>
+    </w:p>
+    <w:p>
+      <w:pPr>
+        <w:numPr>
+          <w:ilvl w:val="3"/>
+          <w:numId w:val="11"/>
+        </w:numPr>
+        <w:spacing w:line="240" w:lineRule="auto"/>
+        <w:rPr>
+          <w:bCs/>
+          <w:lang w:val="en-US"/>
+        </w:rPr>
+      </w:pPr>
+      <w:r>
+        <w:rPr>
+          <w:bCs/>
+          <w:lang w:val="en-US"/>
+        </w:rPr>
+        <w:t>X-Content-Type-Options → verhindert MIME</w:t>
+      </w:r>
+      <w:r>
+        <w:rPr>
+          <w:bCs/>
+          <w:lang w:val="en-US"/>
+        </w:rPr>
+        <w:noBreakHyphen/>
+        <w:t>Sniffing.</w:t>
+      </w:r>
+    </w:p>
+    <w:p>
+      <w:pPr>
+        <w:numPr>
+          <w:ilvl w:val="3"/>
+          <w:numId w:val="11"/>
+        </w:numPr>
+        <w:spacing w:line="240" w:lineRule="auto"/>
+        <w:rPr>
+          <w:bCs/>
+          <w:lang w:val="en-US"/>
+        </w:rPr>
+      </w:pPr>
+      <w:r>
+        <w:rPr>
+          <w:bCs/>
+          <w:lang w:val="en-US"/>
+        </w:rPr>
+        <w:t>X-XSS-Protection → Basisschutz gegen Cross</w:t>
+      </w:r>
+      <w:r>
+        <w:rPr>
+          <w:bCs/>
+          <w:lang w:val="en-US"/>
+        </w:rPr>
+        <w:noBreakHyphen/>
+        <w:t>Site</w:t>
+      </w:r>
+      <w:r>
+        <w:rPr>
+          <w:bCs/>
+          <w:lang w:val="en-US"/>
+        </w:rPr>
+        <w:noBreakHyphen/>
+        <w:t>Scripting.</w:t>
+      </w:r>
+    </w:p>
+    <w:p>
+      <w:pPr>
+        <w:numPr>
+          <w:ilvl w:val="3"/>
+          <w:numId w:val="11"/>
+        </w:numPr>
+        <w:spacing w:line="240" w:lineRule="auto"/>
+        <w:rPr>
+          <w:bCs/>
+          <w:lang w:val="en-US"/>
+        </w:rPr>
+      </w:pPr>
+      <w:r>
+        <w:rPr>
+          <w:bCs/>
+          <w:lang w:val="en-US"/>
+        </w:rPr>
+        <w:t>X-Frame-Options: DENY → verhindert Clickjacking.</w:t>
+      </w:r>
+    </w:p>
+    <w:p>
+      <w:pPr>
+        <w:numPr>
+          <w:ilvl w:val="3"/>
+          <w:numId w:val="11"/>
+        </w:numPr>
+        <w:spacing w:line="240" w:lineRule="auto"/>
+        <w:rPr>
+          <w:bCs/>
+          <w:lang w:val="en-US"/>
+        </w:rPr>
+      </w:pPr>
+      <w:r>
+        <w:rPr>
+          <w:b/>
+          <w:bCs/>
+          <w:lang w:val="en-US"/>
+        </w:rPr>
+        <w:lastRenderedPageBreak/>
+        <w:t>Content Security Policy (CSP)</w:t>
+      </w:r>
+      <w:r>
+        <w:rPr>
+          <w:bCs/>
+          <w:lang w:val="en-US"/>
+        </w:rPr>
+        <w:t xml:space="preserve"> → erlaubt nur Skripte von self, blockiert Frames und Objekte.</w:t>
+      </w:r>
+    </w:p>
+    <w:p>
+      <w:pPr>
+        <w:numPr>
+          <w:ilvl w:val="0"/>
+          <w:numId w:val="11"/>
+        </w:numPr>
+        <w:spacing w:line="240" w:lineRule="auto"/>
+        <w:rPr>
+          <w:bCs/>
+          <w:lang w:val="en-US"/>
+        </w:rPr>
+      </w:pPr>
+      <w:r>
+        <w:rPr>
+          <w:b/>
+          <w:bCs/>
+          <w:lang w:val="en-US"/>
+        </w:rPr>
+        <w:t>CORS</w:t>
+      </w:r>
+      <w:r>
+        <w:rPr>
+          <w:b/>
+          <w:bCs/>
+          <w:lang w:val="en-US"/>
+        </w:rPr>
+        <w:noBreakHyphen/>
+        <w:t>Konfiguration</w:t>
+      </w:r>
+    </w:p>
+    <w:p>
+      <w:pPr>
+        <w:numPr>
+          <w:ilvl w:val="1"/>
+          <w:numId w:val="11"/>
+        </w:numPr>
+        <w:spacing w:line="240" w:lineRule="auto"/>
+        <w:rPr>
+          <w:bCs/>
+          <w:lang w:val="en-US"/>
+        </w:rPr>
+      </w:pPr>
+      <w:r>
+        <w:rPr>
+          <w:bCs/>
+          <w:lang w:val="en-US"/>
+        </w:rPr>
+        <w:t>Klasse: WebConfig</w:t>
+      </w:r>
+    </w:p>
+    <w:p>
+      <w:pPr>
+        <w:numPr>
+          <w:ilvl w:val="1"/>
+          <w:numId w:val="11"/>
+        </w:numPr>
+        <w:spacing w:line="240" w:lineRule="auto"/>
+        <w:rPr>
+          <w:bCs/>
+          <w:lang w:val="en-US"/>
+        </w:rPr>
+      </w:pPr>
+      <w:r>
+        <w:rPr>
+          <w:bCs/>
+          <w:lang w:val="en-US"/>
+        </w:rPr>
+        <w:t>Funktion: Legt fest, welche Origins (z.</w:t>
+      </w:r>
+      <w:r>
+        <w:rPr>
+          <w:rFonts w:ascii="Arial" w:hAnsi="Arial" w:cs="Arial"/>
+          <w:bCs/>
+          <w:lang w:val="en-US"/>
+        </w:rPr>
+        <w:t> </w:t>
+      </w:r>
+      <w:r>
+        <w:rPr>
+          <w:bCs/>
+          <w:lang w:val="en-US"/>
+        </w:rPr>
+        <w:t>B. http://localhost:5173) auf das Backend zugreifen d</w:t>
+      </w:r>
+      <w:r>
+        <w:rPr>
+          <w:rFonts w:ascii="Aptos" w:hAnsi="Aptos" w:cs="Aptos"/>
+          <w:bCs/>
+          <w:lang w:val="en-US"/>
+        </w:rPr>
+        <w:t>ü</w:t>
+      </w:r>
+      <w:r>
+        <w:rPr>
+          <w:bCs/>
+          <w:lang w:val="en-US"/>
+        </w:rPr>
+        <w:t>rfen.</w:t>
+      </w:r>
+    </w:p>
+    <w:p>
+      <w:pPr>
+        <w:numPr>
+          <w:ilvl w:val="1"/>
+          <w:numId w:val="11"/>
+        </w:numPr>
+        <w:spacing w:line="240" w:lineRule="auto"/>
+        <w:rPr>
+          <w:bCs/>
+          <w:lang w:val="en-US"/>
+        </w:rPr>
+      </w:pPr>
+      <w:r>
+        <w:rPr>
+          <w:bCs/>
+          <w:lang w:val="en-US"/>
+        </w:rPr>
+        <w:t>Vorteil: Verhindert Cross</w:t>
+      </w:r>
+      <w:r>
+        <w:rPr>
+          <w:bCs/>
+          <w:lang w:val="en-US"/>
+        </w:rPr>
+        <w:noBreakHyphen/>
+        <w:t>Origin Requests von nicht autorisierten Domains.</w:t>
+      </w:r>
+    </w:p>
+    <w:p>
+      <w:pPr>
+        <w:numPr>
+          <w:ilvl w:val="1"/>
+          <w:numId w:val="11"/>
+        </w:numPr>
+        <w:spacing w:line="240" w:lineRule="auto"/>
+        <w:rPr>
+          <w:bCs/>
+          <w:lang w:val="en-US"/>
+        </w:rPr>
+      </w:pPr>
+      <w:r>
+        <w:rPr>
+          <w:bCs/>
+          <w:lang w:val="en-US"/>
+        </w:rPr>
+        <w:t>Enthält:</w:t>
+      </w:r>
+    </w:p>
+    <w:p>
+      <w:pPr>
+        <w:numPr>
+          <w:ilvl w:val="2"/>
+          <w:numId w:val="11"/>
+        </w:numPr>
+        <w:spacing w:line="240" w:lineRule="auto"/>
+        <w:rPr>
+          <w:bCs/>
+          <w:lang w:val="en-US"/>
+        </w:rPr>
+      </w:pPr>
+      <w:r>
+        <w:rPr>
+          <w:bCs/>
+          <w:lang w:val="en-US"/>
+        </w:rPr>
+        <w:t>Erlaubte Methoden: GET, POST, PUT, DELETE, OPTIONS</w:t>
+      </w:r>
+    </w:p>
+    <w:p>
+      <w:pPr>
+        <w:numPr>
+          <w:ilvl w:val="2"/>
+          <w:numId w:val="11"/>
+        </w:numPr>
+        <w:spacing w:line="240" w:lineRule="auto"/>
+        <w:rPr>
+          <w:bCs/>
+          <w:lang w:val="en-US"/>
+        </w:rPr>
+      </w:pPr>
+      <w:r>
+        <w:rPr>
+          <w:bCs/>
+          <w:lang w:val="en-US"/>
+        </w:rPr>
+        <w:t>Erlaubte Header: *</w:t>
+      </w:r>
+    </w:p>
+    <w:p>
+      <w:pPr>
+        <w:numPr>
+          <w:ilvl w:val="2"/>
+          <w:numId w:val="11"/>
+        </w:numPr>
+        <w:spacing w:line="240" w:lineRule="auto"/>
+        <w:rPr>
+          <w:bCs/>
+          <w:lang w:val="en-US"/>
+        </w:rPr>
+      </w:pPr>
+      <w:r>
+        <w:rPr>
+          <w:bCs/>
+          <w:lang w:val="en-US"/>
+        </w:rPr>
+        <w:t>AllowCredentials = true → Cookies/Sessions können sicher mitgeschickt werden.</w:t>
+      </w:r>
+    </w:p>
+    <w:p>
+      <w:pPr>
+        <w:spacing w:line="240" w:lineRule="auto"/>
+        <w:ind w:left="0" w:firstLine="0"/>
+        <w:rPr>
+          <w:bCs/>
+          <w:lang w:val="en-US"/>
+        </w:rPr>
+      </w:pPr>
+    </w:p>
+    <w:p>
+      <w:pPr>
+        <w:rPr>
+          <w:bCs/>
+          <w:lang w:val="en-US"/>
+        </w:rPr>
+      </w:pPr>
+      <w:r>
+        <w:rPr>
+          <w:bCs/>
+          <w:lang w:val="en-US"/>
+        </w:rPr>
+        <w:br w:type="page"/>
+      </w:r>
     </w:p>
     <w:p>
       <w:pPr>
@@ -1449,6 +2071,155 @@
     </w:lvl>
   </w:abstractNum>
   <w:abstractNum w:abstractNumId="6" w15:restartNumberingAfterBreak="0">
+    <w:nsid w:val="51C07E61"/>
+    <w:multiLevelType w:val="multilevel"/>
+    <w:tmpl w:val="50E4947E"/>
+    <w:lvl w:ilvl="0">
+      <w:start w:val="1"/>
+      <w:numFmt w:val="bullet"/>
+      <w:lvlText w:val=""/>
+      <w:lvlJc w:val="left"/>
+      <w:pPr>
+        <w:tabs>
+          <w:tab w:val="num" w:pos="720"/>
+        </w:tabs>
+        <w:ind w:left="720" w:hanging="360"/>
+      </w:pPr>
+      <w:rPr>
+        <w:rFonts w:ascii="Symbol" w:hAnsi="Symbol" w:hint="default"/>
+        <w:sz w:val="20"/>
+      </w:rPr>
+    </w:lvl>
+    <w:lvl w:ilvl="1">
+      <w:start w:val="1"/>
+      <w:numFmt w:val="bullet"/>
+      <w:lvlText w:val="o"/>
+      <w:lvlJc w:val="left"/>
+      <w:pPr>
+        <w:tabs>
+          <w:tab w:val="num" w:pos="1440"/>
+        </w:tabs>
+        <w:ind w:left="1440" w:hanging="360"/>
+      </w:pPr>
+      <w:rPr>
+        <w:rFonts w:ascii="Courier New" w:hAnsi="Courier New" w:hint="default"/>
+        <w:sz w:val="20"/>
+      </w:rPr>
+    </w:lvl>
+    <w:lvl w:ilvl="2">
+      <w:start w:val="1"/>
+      <w:numFmt w:val="bullet"/>
+      <w:lvlText w:val=""/>
+      <w:lvlJc w:val="left"/>
+      <w:pPr>
+        <w:tabs>
+          <w:tab w:val="num" w:pos="2160"/>
+        </w:tabs>
+        <w:ind w:left="2160" w:hanging="360"/>
+      </w:pPr>
+      <w:rPr>
+        <w:rFonts w:ascii="Wingdings" w:hAnsi="Wingdings" w:hint="default"/>
+        <w:sz w:val="20"/>
+      </w:rPr>
+    </w:lvl>
+    <w:lvl w:ilvl="3">
+      <w:start w:val="1"/>
+      <w:numFmt w:val="bullet"/>
+      <w:lvlText w:val=""/>
+      <w:lvlJc w:val="left"/>
+      <w:pPr>
+        <w:tabs>
+          <w:tab w:val="num" w:pos="2880"/>
+        </w:tabs>
+        <w:ind w:left="2880" w:hanging="360"/>
+      </w:pPr>
+      <w:rPr>
+        <w:rFonts w:ascii="Wingdings" w:hAnsi="Wingdings" w:hint="default"/>
+        <w:sz w:val="20"/>
+      </w:rPr>
+    </w:lvl>
+    <w:lvl w:ilvl="4" w:tentative="1">
+      <w:start w:val="1"/>
+      <w:numFmt w:val="bullet"/>
+      <w:lvlText w:val=""/>
+      <w:lvlJc w:val="left"/>
+      <w:pPr>
+        <w:tabs>
+          <w:tab w:val="num" w:pos="3600"/>
+        </w:tabs>
+        <w:ind w:left="3600" w:hanging="360"/>
+      </w:pPr>
+      <w:rPr>
+        <w:rFonts w:ascii="Wingdings" w:hAnsi="Wingdings" w:hint="default"/>
+        <w:sz w:val="20"/>
+      </w:rPr>
+    </w:lvl>
+    <w:lvl w:ilvl="5" w:tentative="1">
+      <w:start w:val="1"/>
+      <w:numFmt w:val="bullet"/>
+      <w:lvlText w:val=""/>
+      <w:lvlJc w:val="left"/>
+      <w:pPr>
+        <w:tabs>
+          <w:tab w:val="num" w:pos="4320"/>
+        </w:tabs>
+        <w:ind w:left="4320" w:hanging="360"/>
+      </w:pPr>
+      <w:rPr>
+        <w:rFonts w:ascii="Wingdings" w:hAnsi="Wingdings" w:hint="default"/>
+        <w:sz w:val="20"/>
+      </w:rPr>
+    </w:lvl>
+    <w:lvl w:ilvl="6" w:tentative="1">
+      <w:start w:val="1"/>
+      <w:numFmt w:val="bullet"/>
+      <w:lvlText w:val=""/>
+      <w:lvlJc w:val="left"/>
+      <w:pPr>
+        <w:tabs>
+          <w:tab w:val="num" w:pos="5040"/>
+        </w:tabs>
+        <w:ind w:left="5040" w:hanging="360"/>
+      </w:pPr>
+      <w:rPr>
+        <w:rFonts w:ascii="Wingdings" w:hAnsi="Wingdings" w:hint="default"/>
+        <w:sz w:val="20"/>
+      </w:rPr>
+    </w:lvl>
+    <w:lvl w:ilvl="7" w:tentative="1">
+      <w:start w:val="1"/>
+      <w:numFmt w:val="bullet"/>
+      <w:lvlText w:val=""/>
+      <w:lvlJc w:val="left"/>
+      <w:pPr>
+        <w:tabs>
+          <w:tab w:val="num" w:pos="5760"/>
+        </w:tabs>
+        <w:ind w:left="5760" w:hanging="360"/>
+      </w:pPr>
+      <w:rPr>
+        <w:rFonts w:ascii="Wingdings" w:hAnsi="Wingdings" w:hint="default"/>
+        <w:sz w:val="20"/>
+      </w:rPr>
+    </w:lvl>
+    <w:lvl w:ilvl="8" w:tentative="1">
+      <w:start w:val="1"/>
+      <w:numFmt w:val="bullet"/>
+      <w:lvlText w:val=""/>
+      <w:lvlJc w:val="left"/>
+      <w:pPr>
+        <w:tabs>
+          <w:tab w:val="num" w:pos="6480"/>
+        </w:tabs>
+        <w:ind w:left="6480" w:hanging="360"/>
+      </w:pPr>
+      <w:rPr>
+        <w:rFonts w:ascii="Wingdings" w:hAnsi="Wingdings" w:hint="default"/>
+        <w:sz w:val="20"/>
+      </w:rPr>
+    </w:lvl>
+  </w:abstractNum>
+  <w:abstractNum w:abstractNumId="7" w15:restartNumberingAfterBreak="0">
     <w:nsid w:val="53FC3783"/>
     <w:multiLevelType w:val="hybridMultilevel"/>
     <w:tmpl w:val="9274D648"/>
@@ -1561,7 +2332,7 @@
       </w:rPr>
     </w:lvl>
   </w:abstractNum>
-  <w:abstractNum w:abstractNumId="7" w15:restartNumberingAfterBreak="0">
+  <w:abstractNum w:abstractNumId="8" w15:restartNumberingAfterBreak="0">
     <w:nsid w:val="5741114D"/>
     <w:multiLevelType w:val="multilevel"/>
     <w:tmpl w:val="C932417C"/>
@@ -1710,7 +2481,7 @@
       </w:rPr>
     </w:lvl>
   </w:abstractNum>
-  <w:abstractNum w:abstractNumId="8" w15:restartNumberingAfterBreak="0">
+  <w:abstractNum w:abstractNumId="9" w15:restartNumberingAfterBreak="0">
     <w:nsid w:val="7CB74A9E"/>
     <w:multiLevelType w:val="multilevel"/>
     <w:tmpl w:val="CD5CE540"/>
@@ -1859,7 +2630,7 @@
       </w:rPr>
     </w:lvl>
   </w:abstractNum>
-  <w:abstractNum w:abstractNumId="9" w15:restartNumberingAfterBreak="0">
+  <w:abstractNum w:abstractNumId="10" w15:restartNumberingAfterBreak="0">
     <w:nsid w:val="7FE0155F"/>
     <w:multiLevelType w:val="multilevel"/>
     <w:tmpl w:val="1722FCC2"/>
@@ -2009,13 +2780,13 @@
     </w:lvl>
   </w:abstractNum>
   <w:num w:numId="1" w16cid:durableId="658772942">
-    <w:abstractNumId w:val="8"/>
+    <w:abstractNumId w:val="9"/>
   </w:num>
   <w:num w:numId="2" w16cid:durableId="1459759071">
     <w:abstractNumId w:val="5"/>
   </w:num>
   <w:num w:numId="3" w16cid:durableId="1318220380">
-    <w:abstractNumId w:val="7"/>
+    <w:abstractNumId w:val="8"/>
   </w:num>
   <w:num w:numId="4" w16cid:durableId="297689201">
     <w:abstractNumId w:val="1"/>
@@ -2027,16 +2798,19 @@
     <w:abstractNumId w:val="2"/>
   </w:num>
   <w:num w:numId="7" w16cid:durableId="454098948">
-    <w:abstractNumId w:val="9"/>
+    <w:abstractNumId w:val="10"/>
   </w:num>
   <w:num w:numId="8" w16cid:durableId="2136827919">
-    <w:abstractNumId w:val="6"/>
+    <w:abstractNumId w:val="7"/>
   </w:num>
   <w:num w:numId="9" w16cid:durableId="61146902">
     <w:abstractNumId w:val="0"/>
   </w:num>
   <w:num w:numId="10" w16cid:durableId="387150732">
     <w:abstractNumId w:val="3"/>
+  </w:num>
+  <w:num w:numId="11" w16cid:durableId="356974826">
+    <w:abstractNumId w:val="6"/>
   </w:num>
 </w:numbering>
 </file>
@@ -2857,6 +3631,7 @@
       <w:numPr>
         <w:ilvl w:val="1"/>
       </w:numPr>
+      <w:ind w:left="714" w:hanging="357"/>
     </w:pPr>
     <w:rPr>
       <w:rFonts w:eastAsiaTheme="majorEastAsia" w:cstheme="majorBidi"/>

</xml_diff>